<commit_message>
Gradient fixes, fixed test cases
</commit_message>
<xml_diff>
--- a/tests/fixtures/cases/case35/input.docx
+++ b/tests/fixtures/cases/case35/input.docx
@@ -44,27 +44,13 @@
                       <w:p>
                         <w:pPr>
                           <w:jc w:val="center"/>
-                          <w:spacing w:after="0" w:line="240" w:lineRule="auto"/>
                         </w:pPr>
                         <w:r>
                           <w:rPr>
-                            <w:sz w:val="14"/>
+                            <w:sz w:val="16"/>
                             <w:color w:val="FFFFFF"/>
                           </w:rPr>
-                          <w:t>roundRect</w:t>
-                        </w:r>
-                      </w:p>
-                      <w:p>
-                        <w:pPr>
-                          <w:jc w:val="center"/>
-                          <w:spacing w:after="0" w:line="240" w:lineRule="auto"/>
-                        </w:pPr>
-                        <w:r>
-                          <w:rPr>
-                            <w:sz w:val="14"/>
-                            <w:color w:val="FFFFFF"/>
-                          </w:rPr>
-                          <w:t>default</w:t>
+                          <w:t>roundRect default</w:t>
                         </w:r>
                       </w:p>
                     </w:txbxContent>
@@ -119,27 +105,13 @@
                       <w:p>
                         <w:pPr>
                           <w:jc w:val="center"/>
-                          <w:spacing w:after="0" w:line="240" w:lineRule="auto"/>
                         </w:pPr>
                         <w:r>
                           <w:rPr>
-                            <w:sz w:val="14"/>
+                            <w:sz w:val="16"/>
                             <w:color w:val="FFFFFF"/>
                           </w:rPr>
-                          <w:t>roundRect</w:t>
-                        </w:r>
-                      </w:p>
-                      <w:p>
-                        <w:pPr>
-                          <w:jc w:val="center"/>
-                          <w:spacing w:after="0" w:line="240" w:lineRule="auto"/>
-                        </w:pPr>
-                        <w:r>
-                          <w:rPr>
-                            <w:sz w:val="14"/>
-                            <w:color w:val="FFFFFF"/>
-                          </w:rPr>
-                          <w:t>adj=40000</w:t>
+                          <w:t>roundRect adj=40000</w:t>
                         </w:r>
                       </w:p>
                     </w:txbxContent>
@@ -192,27 +164,13 @@
                       <w:p>
                         <w:pPr>
                           <w:jc w:val="center"/>
-                          <w:spacing w:after="0" w:line="240" w:lineRule="auto"/>
                         </w:pPr>
                         <w:r>
                           <w:rPr>
-                            <w:sz w:val="14"/>
+                            <w:sz w:val="16"/>
                             <w:color w:val="000000"/>
                           </w:rPr>
-                          <w:t>star5</w:t>
-                        </w:r>
-                      </w:p>
-                      <w:p>
-                        <w:pPr>
-                          <w:jc w:val="center"/>
-                          <w:spacing w:after="0" w:line="240" w:lineRule="auto"/>
-                        </w:pPr>
-                        <w:r>
-                          <w:rPr>
-                            <w:sz w:val="14"/>
-                            <w:color w:val="000000"/>
-                          </w:rPr>
-                          <w:t>default</w:t>
+                          <w:t>star5 default</w:t>
                         </w:r>
                       </w:p>
                     </w:txbxContent>
@@ -251,6 +209,8 @@
                     <a:prstGeom prst="star5">
                       <a:avLst>
                         <a:gd name="adj" fmla="val 35000"/>
+                        <a:gd name="hf" fmla="val 105146"/>
+                        <a:gd name="vf" fmla="val 110557"/>
                       </a:avLst>
                     </a:prstGeom>
                     <a:solidFill>
@@ -267,27 +227,13 @@
                       <w:p>
                         <w:pPr>
                           <w:jc w:val="center"/>
-                          <w:spacing w:after="0" w:line="240" w:lineRule="auto"/>
                         </w:pPr>
                         <w:r>
                           <w:rPr>
-                            <w:sz w:val="14"/>
+                            <w:sz w:val="16"/>
                             <w:color w:val="FFFFFF"/>
                           </w:rPr>
-                          <w:t>star5</w:t>
-                        </w:r>
-                      </w:p>
-                      <w:p>
-                        <w:pPr>
-                          <w:jc w:val="center"/>
-                          <w:spacing w:after="0" w:line="240" w:lineRule="auto"/>
-                        </w:pPr>
-                        <w:r>
-                          <w:rPr>
-                            <w:sz w:val="14"/>
-                            <w:color w:val="FFFFFF"/>
-                          </w:rPr>
-                          <w:t>adj=35000</w:t>
+                          <w:t>star5 adj=35000</w:t>
                         </w:r>
                       </w:p>
                     </w:txbxContent>
@@ -340,27 +286,13 @@
                       <w:p>
                         <w:pPr>
                           <w:jc w:val="center"/>
-                          <w:spacing w:after="0" w:line="240" w:lineRule="auto"/>
                         </w:pPr>
                         <w:r>
                           <w:rPr>
-                            <w:sz w:val="14"/>
+                            <w:sz w:val="16"/>
                             <w:color w:val="FFFFFF"/>
                           </w:rPr>
-                          <w:t>rightArrow</w:t>
-                        </w:r>
-                      </w:p>
-                      <w:p>
-                        <w:pPr>
-                          <w:jc w:val="center"/>
-                          <w:spacing w:after="0" w:line="240" w:lineRule="auto"/>
-                        </w:pPr>
-                        <w:r>
-                          <w:rPr>
-                            <w:sz w:val="14"/>
-                            <w:color w:val="FFFFFF"/>
-                          </w:rPr>
-                          <w:t>default</w:t>
+                          <w:t>rightArrow default</w:t>
                         </w:r>
                       </w:p>
                     </w:txbxContent>
@@ -416,40 +348,13 @@
                       <w:p>
                         <w:pPr>
                           <w:jc w:val="center"/>
-                          <w:spacing w:after="0" w:line="240" w:lineRule="auto"/>
                         </w:pPr>
                         <w:r>
                           <w:rPr>
-                            <w:sz w:val="14"/>
+                            <w:sz w:val="16"/>
                             <w:color w:val="FFFFFF"/>
                           </w:rPr>
-                          <w:t>rightArrow</w:t>
-                        </w:r>
-                      </w:p>
-                      <w:p>
-                        <w:pPr>
-                          <w:jc w:val="center"/>
-                          <w:spacing w:after="0" w:line="240" w:lineRule="auto"/>
-                        </w:pPr>
-                        <w:r>
-                          <w:rPr>
-                            <w:sz w:val="14"/>
-                            <w:color w:val="FFFFFF"/>
-                          </w:rPr>
-                          <w:t>adj1=25000</w:t>
-                        </w:r>
-                      </w:p>
-                      <w:p>
-                        <w:pPr>
-                          <w:jc w:val="center"/>
-                          <w:spacing w:after="0" w:line="240" w:lineRule="auto"/>
-                        </w:pPr>
-                        <w:r>
-                          <w:rPr>
-                            <w:sz w:val="14"/>
-                            <w:color w:val="FFFFFF"/>
-                          </w:rPr>
-                          <w:t>adj2=75000</w:t>
+                          <w:t>rightArrow adj1=25000 adj2=75000</w:t>
                         </w:r>
                       </w:p>
                     </w:txbxContent>
@@ -502,27 +407,13 @@
                       <w:p>
                         <w:pPr>
                           <w:jc w:val="center"/>
-                          <w:spacing w:after="0" w:line="240" w:lineRule="auto"/>
                         </w:pPr>
                         <w:r>
                           <w:rPr>
-                            <w:sz w:val="14"/>
+                            <w:sz w:val="16"/>
                             <w:color w:val="000000"/>
                           </w:rPr>
-                          <w:t>hexagon</w:t>
-                        </w:r>
-                      </w:p>
-                      <w:p>
-                        <w:pPr>
-                          <w:jc w:val="center"/>
-                          <w:spacing w:after="0" w:line="240" w:lineRule="auto"/>
-                        </w:pPr>
-                        <w:r>
-                          <w:rPr>
-                            <w:sz w:val="14"/>
-                            <w:color w:val="000000"/>
-                          </w:rPr>
-                          <w:t>default</w:t>
+                          <w:t>hexagon default</w:t>
                         </w:r>
                       </w:p>
                     </w:txbxContent>
@@ -561,6 +452,7 @@
                     <a:prstGeom prst="hexagon">
                       <a:avLst>
                         <a:gd name="adj" fmla="val 10000"/>
+                        <a:gd name="vf" fmla="val 115470"/>
                       </a:avLst>
                     </a:prstGeom>
                     <a:solidFill>
@@ -577,27 +469,13 @@
                       <w:p>
                         <w:pPr>
                           <w:jc w:val="center"/>
-                          <w:spacing w:after="0" w:line="240" w:lineRule="auto"/>
                         </w:pPr>
                         <w:r>
                           <w:rPr>
-                            <w:sz w:val="14"/>
+                            <w:sz w:val="16"/>
                             <w:color w:val="FFFFFF"/>
                           </w:rPr>
-                          <w:t>hexagon</w:t>
-                        </w:r>
-                      </w:p>
-                      <w:p>
-                        <w:pPr>
-                          <w:jc w:val="center"/>
-                          <w:spacing w:after="0" w:line="240" w:lineRule="auto"/>
-                        </w:pPr>
-                        <w:r>
-                          <w:rPr>
-                            <w:sz w:val="14"/>
-                            <w:color w:val="FFFFFF"/>
-                          </w:rPr>
-                          <w:t>adj=10000</w:t>
+                          <w:t>hexagon adj=10000</w:t>
                         </w:r>
                       </w:p>
                     </w:txbxContent>
@@ -650,27 +528,13 @@
                       <w:p>
                         <w:pPr>
                           <w:jc w:val="center"/>
-                          <w:spacing w:after="0" w:line="240" w:lineRule="auto"/>
                         </w:pPr>
                         <w:r>
                           <w:rPr>
-                            <w:sz w:val="14"/>
+                            <w:sz w:val="16"/>
                             <w:color w:val="000000"/>
                           </w:rPr>
-                          <w:t>trapezoid</w:t>
-                        </w:r>
-                      </w:p>
-                      <w:p>
-                        <w:pPr>
-                          <w:jc w:val="center"/>
-                          <w:spacing w:after="0" w:line="240" w:lineRule="auto"/>
-                        </w:pPr>
-                        <w:r>
-                          <w:rPr>
-                            <w:sz w:val="14"/>
-                            <w:color w:val="000000"/>
-                          </w:rPr>
-                          <w:t>default</w:t>
+                          <w:t>trapezoid default</w:t>
                         </w:r>
                       </w:p>
                     </w:txbxContent>
@@ -725,27 +589,13 @@
                       <w:p>
                         <w:pPr>
                           <w:jc w:val="center"/>
-                          <w:spacing w:after="0" w:line="240" w:lineRule="auto"/>
                         </w:pPr>
                         <w:r>
                           <w:rPr>
-                            <w:sz w:val="14"/>
+                            <w:sz w:val="16"/>
                             <w:color w:val="FFFFFF"/>
                           </w:rPr>
-                          <w:t>trapezoid</w:t>
-                        </w:r>
-                      </w:p>
-                      <w:p>
-                        <w:pPr>
-                          <w:jc w:val="center"/>
-                          <w:spacing w:after="0" w:line="240" w:lineRule="auto"/>
-                        </w:pPr>
-                        <w:r>
-                          <w:rPr>
-                            <w:sz w:val="14"/>
-                            <w:color w:val="FFFFFF"/>
-                          </w:rPr>
-                          <w:t>adj=10000</w:t>
+                          <w:t>trapezoid adj=10000</w:t>
                         </w:r>
                       </w:p>
                     </w:txbxContent>
@@ -798,27 +648,13 @@
                       <w:p>
                         <w:pPr>
                           <w:jc w:val="center"/>
-                          <w:spacing w:after="0" w:line="240" w:lineRule="auto"/>
                         </w:pPr>
                         <w:r>
                           <w:rPr>
-                            <w:sz w:val="14"/>
+                            <w:sz w:val="16"/>
                             <w:color w:val="FFFFFF"/>
                           </w:rPr>
-                          <w:t>plus</w:t>
-                        </w:r>
-                      </w:p>
-                      <w:p>
-                        <w:pPr>
-                          <w:jc w:val="center"/>
-                          <w:spacing w:after="0" w:line="240" w:lineRule="auto"/>
-                        </w:pPr>
-                        <w:r>
-                          <w:rPr>
-                            <w:sz w:val="14"/>
-                            <w:color w:val="FFFFFF"/>
-                          </w:rPr>
-                          <w:t>default</w:t>
+                          <w:t>plus default</w:t>
                         </w:r>
                       </w:p>
                     </w:txbxContent>
@@ -873,27 +709,13 @@
                       <w:p>
                         <w:pPr>
                           <w:jc w:val="center"/>
-                          <w:spacing w:after="0" w:line="240" w:lineRule="auto"/>
                         </w:pPr>
                         <w:r>
                           <w:rPr>
-                            <w:sz w:val="14"/>
+                            <w:sz w:val="16"/>
                             <w:color w:val="FFFFFF"/>
                           </w:rPr>
-                          <w:t>plus</w:t>
-                        </w:r>
-                      </w:p>
-                      <w:p>
-                        <w:pPr>
-                          <w:jc w:val="center"/>
-                          <w:spacing w:after="0" w:line="240" w:lineRule="auto"/>
-                        </w:pPr>
-                        <w:r>
-                          <w:rPr>
-                            <w:sz w:val="14"/>
-                            <w:color w:val="FFFFFF"/>
-                          </w:rPr>
-                          <w:t>adj=10000</w:t>
+                          <w:t>plus adj=10000</w:t>
                         </w:r>
                       </w:p>
                     </w:txbxContent>
@@ -946,27 +768,13 @@
                       <w:p>
                         <w:pPr>
                           <w:jc w:val="center"/>
-                          <w:spacing w:after="0" w:line="240" w:lineRule="auto"/>
                         </w:pPr>
                         <w:r>
                           <w:rPr>
-                            <w:sz w:val="14"/>
+                            <w:sz w:val="16"/>
                             <w:color w:val="000000"/>
                           </w:rPr>
-                          <w:t>donut</w:t>
-                        </w:r>
-                      </w:p>
-                      <w:p>
-                        <w:pPr>
-                          <w:jc w:val="center"/>
-                          <w:spacing w:after="0" w:line="240" w:lineRule="auto"/>
-                        </w:pPr>
-                        <w:r>
-                          <w:rPr>
-                            <w:sz w:val="14"/>
-                            <w:color w:val="000000"/>
-                          </w:rPr>
-                          <w:t>default</w:t>
+                          <w:t>donut default</w:t>
                         </w:r>
                       </w:p>
                     </w:txbxContent>
@@ -1021,27 +829,13 @@
                       <w:p>
                         <w:pPr>
                           <w:jc w:val="center"/>
-                          <w:spacing w:after="0" w:line="240" w:lineRule="auto"/>
                         </w:pPr>
                         <w:r>
                           <w:rPr>
-                            <w:sz w:val="14"/>
+                            <w:sz w:val="16"/>
                             <w:color w:val="000000"/>
                           </w:rPr>
-                          <w:t>donut</w:t>
-                        </w:r>
-                      </w:p>
-                      <w:p>
-                        <w:pPr>
-                          <w:jc w:val="center"/>
-                          <w:spacing w:after="0" w:line="240" w:lineRule="auto"/>
-                        </w:pPr>
-                        <w:r>
-                          <w:rPr>
-                            <w:sz w:val="14"/>
-                            <w:color w:val="000000"/>
-                          </w:rPr>
-                          <w:t>adj=10000</w:t>
+                          <w:t>donut adj=10000</w:t>
                         </w:r>
                       </w:p>
                     </w:txbxContent>
@@ -1094,27 +888,13 @@
                       <w:p>
                         <w:pPr>
                           <w:jc w:val="center"/>
-                          <w:spacing w:after="0" w:line="240" w:lineRule="auto"/>
                         </w:pPr>
                         <w:r>
                           <w:rPr>
-                            <w:sz w:val="14"/>
+                            <w:sz w:val="16"/>
                             <w:color w:val="FFFFFF"/>
                           </w:rPr>
-                          <w:t>frame</w:t>
-                        </w:r>
-                      </w:p>
-                      <w:p>
-                        <w:pPr>
-                          <w:jc w:val="center"/>
-                          <w:spacing w:after="0" w:line="240" w:lineRule="auto"/>
-                        </w:pPr>
-                        <w:r>
-                          <w:rPr>
-                            <w:sz w:val="14"/>
-                            <w:color w:val="FFFFFF"/>
-                          </w:rPr>
-                          <w:t>default</w:t>
+                          <w:t>frame default</w:t>
                         </w:r>
                       </w:p>
                     </w:txbxContent>
@@ -1169,27 +949,13 @@
                       <w:p>
                         <w:pPr>
                           <w:jc w:val="center"/>
-                          <w:spacing w:after="0" w:line="240" w:lineRule="auto"/>
                         </w:pPr>
                         <w:r>
                           <w:rPr>
-                            <w:sz w:val="14"/>
+                            <w:sz w:val="16"/>
                             <w:color w:val="FFFFFF"/>
                           </w:rPr>
-                          <w:t>frame</w:t>
-                        </w:r>
-                      </w:p>
-                      <w:p>
-                        <w:pPr>
-                          <w:jc w:val="center"/>
-                          <w:spacing w:after="0" w:line="240" w:lineRule="auto"/>
-                        </w:pPr>
-                        <w:r>
-                          <w:rPr>
-                            <w:sz w:val="14"/>
-                            <w:color w:val="FFFFFF"/>
-                          </w:rPr>
-                          <w:t>adj1=30000</w:t>
+                          <w:t>frame adj1=30000</w:t>
                         </w:r>
                       </w:p>
                     </w:txbxContent>
@@ -1242,27 +1008,13 @@
                       <w:p>
                         <w:pPr>
                           <w:jc w:val="center"/>
-                          <w:spacing w:after="0" w:line="240" w:lineRule="auto"/>
                         </w:pPr>
                         <w:r>
                           <w:rPr>
-                            <w:sz w:val="14"/>
+                            <w:sz w:val="16"/>
                             <w:color w:val="000000"/>
                           </w:rPr>
-                          <w:t>chevron</w:t>
-                        </w:r>
-                      </w:p>
-                      <w:p>
-                        <w:pPr>
-                          <w:jc w:val="center"/>
-                          <w:spacing w:after="0" w:line="240" w:lineRule="auto"/>
-                        </w:pPr>
-                        <w:r>
-                          <w:rPr>
-                            <w:sz w:val="14"/>
-                            <w:color w:val="000000"/>
-                          </w:rPr>
-                          <w:t>default</w:t>
+                          <w:t>chevron default</w:t>
                         </w:r>
                       </w:p>
                     </w:txbxContent>
@@ -1317,27 +1069,13 @@
                       <w:p>
                         <w:pPr>
                           <w:jc w:val="center"/>
-                          <w:spacing w:after="0" w:line="240" w:lineRule="auto"/>
                         </w:pPr>
                         <w:r>
                           <w:rPr>
-                            <w:sz w:val="14"/>
+                            <w:sz w:val="16"/>
                             <w:color w:val="FFFFFF"/>
                           </w:rPr>
-                          <w:t>chevron</w:t>
-                        </w:r>
-                      </w:p>
-                      <w:p>
-                        <w:pPr>
-                          <w:jc w:val="center"/>
-                          <w:spacing w:after="0" w:line="240" w:lineRule="auto"/>
-                        </w:pPr>
-                        <w:r>
-                          <w:rPr>
-                            <w:sz w:val="14"/>
-                            <w:color w:val="FFFFFF"/>
-                          </w:rPr>
-                          <w:t>adj=25000</w:t>
+                          <w:t>chevron adj=25000</w:t>
                         </w:r>
                       </w:p>
                     </w:txbxContent>
@@ -1390,27 +1128,13 @@
                       <w:p>
                         <w:pPr>
                           <w:jc w:val="center"/>
-                          <w:spacing w:after="0" w:line="240" w:lineRule="auto"/>
                         </w:pPr>
                         <w:r>
                           <w:rPr>
-                            <w:sz w:val="14"/>
+                            <w:sz w:val="16"/>
                             <w:color w:val="000000"/>
                           </w:rPr>
-                          <w:t>triangle</w:t>
-                        </w:r>
-                      </w:p>
-                      <w:p>
-                        <w:pPr>
-                          <w:jc w:val="center"/>
-                          <w:spacing w:after="0" w:line="240" w:lineRule="auto"/>
-                        </w:pPr>
-                        <w:r>
-                          <w:rPr>
-                            <w:sz w:val="14"/>
-                            <w:color w:val="000000"/>
-                          </w:rPr>
-                          <w:t>default</w:t>
+                          <w:t>triangle default</w:t>
                         </w:r>
                       </w:p>
                     </w:txbxContent>
@@ -1465,27 +1189,13 @@
                       <w:p>
                         <w:pPr>
                           <w:jc w:val="center"/>
-                          <w:spacing w:after="0" w:line="240" w:lineRule="auto"/>
                         </w:pPr>
                         <w:r>
                           <w:rPr>
-                            <w:sz w:val="14"/>
+                            <w:sz w:val="16"/>
                             <w:color w:val="FFFFFF"/>
                           </w:rPr>
-                          <w:t>triangle</w:t>
-                        </w:r>
-                      </w:p>
-                      <w:p>
-                        <w:pPr>
-                          <w:jc w:val="center"/>
-                          <w:spacing w:after="0" w:line="240" w:lineRule="auto"/>
-                        </w:pPr>
-                        <w:r>
-                          <w:rPr>
-                            <w:sz w:val="14"/>
-                            <w:color w:val="FFFFFF"/>
-                          </w:rPr>
-                          <w:t>adj=80000</w:t>
+                          <w:t>triangle adj=80000</w:t>
                         </w:r>
                       </w:p>
                     </w:txbxContent>

</xml_diff>